<commit_message>
docs(qa): update master test plan and docx for wired auth and e-reporting
Le .docx datait de la rédaction du plan, avant que l'US-26 ne câble
AuthGate sur SQLDelight et l'e-Reporting dans les Paramètres : le Word
distribué en recette portait encore les avertissements d'écrans
injoignables que le Markdown avait déjà perdus.

Régénération à partir du Markdown courant. Le sous-titre de couverture
suit le périmètre réel du plan (US-01 à US-26, il annonçait US-25).

Le Markdown était déjà à jour — encart transversal levé, bandeaux des
modules 1 et 11 remplacés par leurs points d'accès réels, point 1 de la
dette technique clos. Ce commit ne porte donc que le document généré.

Co-Authored-By: Claude Opus 5 <noreply@anthropic.com>
</commit_message>
<xml_diff>
--- a/qa/MASTER_TEST_PLAN_MOBILE.docx
+++ b/qa/MASTER_TEST_PLAN_MOBILE.docx
@@ -26,7 +26,7 @@
           <w:sz w:val="26"/>
           <w:szCs w:val="26"/>
         </w:rPr>
-        <w:t xml:space="preserve">US-01 à US-25 — Cahier de recette fonctionnel manuel</w:t>
+        <w:t xml:space="preserve">US-01 à US-26 — Cahier de recette fonctionnel manuel</w:t>
       </w:r>
     </w:p>
     <w:p>
@@ -35,7 +35,7 @@
         <w:spacing w:after="140" w:before="280"/>
       </w:pPr>
       <w:r>
-        <w:t xml:space="preserve">Master Test Plan — LedgerHub Mobile (US-01 à US-25)</w:t>
+        <w:t xml:space="preserve">Master Test Plan — LedgerHub Mobile (US-01 à US-26)</w:t>
       </w:r>
     </w:p>
     <w:p>
@@ -65,7 +65,7 @@
         <w:t xml:space="preserve">Périmètre :</w:t>
       </w:r>
       <w:r>
-        <w:t xml:space="preserve"> parité fonctionnelle mobile, 25 User Stories</w:t>
+        <w:t xml:space="preserve"> parité fonctionnelle mobile, 26 User Stories</w:t>
       </w:r>
     </w:p>
     <w:p>
@@ -314,7 +314,7 @@
         <w:spacing w:after="140" w:before="400"/>
       </w:pPr>
       <w:r>
-        <w:t xml:space="preserve">⚠️ Point d'attention transversal — deux écrans non câblés dans la navigation</w:t>
+        <w:t xml:space="preserve">✅ Point d'attention transversal — levé en US-26</w:t>
       </w:r>
     </w:p>
     <w:p>
@@ -346,59 +346,55 @@
         <w:t xml:space="preserve">ereporting_screen</w:t>
       </w:r>
       <w:r>
-        <w:t xml:space="preserve">, module 11) </w:t>
-      </w:r>
-      <w:r>
-        <w:rPr>
-          <w:b/>
-          <w:bCs/>
-        </w:rPr>
-        <w:t xml:space="preserve">existent dans le code mais ne sont reliés à aucune navigation de l'application</w:t>
-      </w:r>
-      <w:r>
-        <w:t xml:space="preserve"> : </w:t>
-      </w:r>
-      <w:r>
-        <w:rPr>
-          <w:rFonts w:ascii="Consolas" w:cs="Consolas" w:eastAsia="Consolas" w:hAnsi="Consolas"/>
-          <w:sz w:val="20"/>
-          <w:szCs w:val="20"/>
-          <w:shd w:fill="EEEEEE" w:val="clear"/>
-        </w:rPr>
-        <w:t xml:space="preserve">App.kt</w:t>
-      </w:r>
-      <w:r>
-        <w:t xml:space="preserve"> ne les référence nulle part, et aucun bouton du shell n'y mène. Un testeur qui lance l'application arrive directement sur le tableau de bord, base de démonstration déjà peuplée, sans jamais croiser ces deux écrans. Les modules 1 et 11 documentent les scénarios attendus </w:t>
-      </w:r>
-      <w:r>
-        <w:rPr>
-          <w:b/>
-          <w:bCs/>
-        </w:rPr>
-        <w:t xml:space="preserve">pour mémoire et pour une recette outillée</w:t>
-      </w:r>
-      <w:r>
-        <w:t xml:space="preserve"> (harnais de test dédié), mais un testeur manuel sur l'APK standard doit les sauter et les signaler comme </w:t>
-      </w:r>
-      <w:r>
-        <w:rPr>
-          <w:b/>
-          <w:bCs/>
-        </w:rPr>
-        <w:t xml:space="preserve">non exécutables en l'état</w:t>
-      </w:r>
-      <w:r>
-        <w:t xml:space="preserve"> plutôt que comme échec. Détail complet, avec les autres anomalies connues, dans l'encart </w:t>
-      </w:r>
-      <w:r>
-        <w:rPr>
-          <w:b/>
-          <w:bCs/>
-        </w:rPr>
-        <w:t xml:space="preserve">⚠️ Dette Technique &amp; Anomalies Connues</w:t>
-      </w:r>
-      <w:r>
-        <w:t xml:space="preserve"> en fin de document.</w:t>
+        <w:t xml:space="preserve">, module 11) n'étaient reliés à aucune navigation : un testeur arrivait directement sur le tableau de bord sans jamais les croiser. </w:t>
+      </w:r>
+      <w:r>
+        <w:rPr>
+          <w:b/>
+          <w:bCs/>
+        </w:rPr>
+        <w:t xml:space="preserve">C'est corrigé.</w:t>
+      </w:r>
+      <w:r>
+        <w:t xml:space="preserve"> L'application s'ouvre désormais sur l'écran d'authentification, et l'e-Reporting est joignable depuis l'onglet Paramètres. Les modules 1 et 11 sont donc </w:t>
+      </w:r>
+      <w:r>
+        <w:rPr>
+          <w:b/>
+          <w:bCs/>
+        </w:rPr>
+        <w:t xml:space="preserve">exécutables manuellement sur l'APK standard</w:t>
+      </w:r>
+      <w:r>
+        <w:t xml:space="preserve">.</w:t>
+      </w:r>
+    </w:p>
+    <w:p>
+      <w:pPr>
+        <w:spacing w:after="120"/>
+      </w:pPr>
+      <w:r>
+        <w:t xml:space="preserve">L'authentification est en outre devenue </w:t>
+      </w:r>
+      <w:r>
+        <w:rPr>
+          <w:b/>
+          <w:bCs/>
+        </w:rPr>
+        <w:t xml:space="preserve">autonome</w:t>
+      </w:r>
+      <w:r>
+        <w:t xml:space="preserve"> (US-26) : le compte est créé puis vérifié dans la base SQLDelight de l'appareil, sans serveur ni réseau. Les scénarios ci-dessous n'exigent plus aucun backend démarré ; en revanche, </w:t>
+      </w:r>
+      <w:r>
+        <w:rPr>
+          <w:b/>
+          <w:bCs/>
+        </w:rPr>
+        <w:t xml:space="preserve">une installation neuve n'a aucun compte</w:t>
+      </w:r>
+      <w:r>
+        <w:t xml:space="preserve"> — il faut s'inscrire avant de pouvoir se connecter.</w:t>
       </w:r>
     </w:p>
     <w:p>
@@ -416,7 +412,7 @@
         <w:spacing w:after="140" w:before="400"/>
       </w:pPr>
       <w:r>
-        <w:t xml:space="preserve">1. Inscription &amp; Authentification (US-21)</w:t>
+        <w:t xml:space="preserve">1. Inscription &amp; Authentification (US-21, US-26)</w:t>
       </w:r>
     </w:p>
     <w:p>
@@ -433,61 +429,23 @@
           <w:i/>
           <w:iCs/>
         </w:rPr>
-        <w:t xml:space="preserve">⚠️ Non atteignable depuis le parcours normal de l'application — voir l'avertissement ci-dessus. Les scénarios suivants supposent un harnais de test qui monte </w:t>
-      </w:r>
-      <w:r>
-        <w:rPr>
-          <w:rFonts w:ascii="Consolas" w:cs="Consolas" w:eastAsia="Consolas" w:hAnsi="Consolas"/>
+        <w:t xml:space="preserve">Écran d'accueil de l'application depuis l'US-26 : il s'affiche au lancement, avant le shell. Le compte vit dans la base locale de l'appareil — aucun serveur à démarrer, et </w:t>
+      </w:r>
+      <w:r>
+        <w:rPr>
+          <w:b/>
+          <w:bCs/>
           <w:i/>
           <w:iCs/>
-          <w:sz w:val="20"/>
-          <w:szCs w:val="20"/>
-          <w:shd w:fill="EEEEEE" w:val="clear"/>
-        </w:rPr>
-        <w:t xml:space="preserve">AuthScreen</w:t>
+        </w:rPr>
+        <w:t xml:space="preserve">aucun compte préexistant sur une installation neuve</w:t>
       </w:r>
       <w:r>
         <w:rPr>
           <w:i/>
           <w:iCs/>
         </w:rPr>
-        <w:t xml:space="preserve"> directement (</w:t>
-      </w:r>
-      <w:r>
-        <w:rPr>
-          <w:rFonts w:ascii="Consolas" w:cs="Consolas" w:eastAsia="Consolas" w:hAnsi="Consolas"/>
-          <w:i/>
-          <w:iCs/>
-          <w:sz w:val="20"/>
-          <w:szCs w:val="20"/>
-          <w:shd w:fill="EEEEEE" w:val="clear"/>
-        </w:rPr>
-        <w:t xml:space="preserve">login_screen</w:t>
-      </w:r>
-      <w:r>
-        <w:rPr>
-          <w:i/>
-          <w:iCs/>
-        </w:rPr>
-        <w:t xml:space="preserve">), ou une future intégration dans </w:t>
-      </w:r>
-      <w:r>
-        <w:rPr>
-          <w:rFonts w:ascii="Consolas" w:cs="Consolas" w:eastAsia="Consolas" w:hAnsi="Consolas"/>
-          <w:i/>
-          <w:iCs/>
-          <w:sz w:val="20"/>
-          <w:szCs w:val="20"/>
-          <w:shd w:fill="EEEEEE" w:val="clear"/>
-        </w:rPr>
-        <w:t xml:space="preserve">App.kt</w:t>
-      </w:r>
-      <w:r>
-        <w:rPr>
-          <w:i/>
-          <w:iCs/>
-        </w:rPr>
-        <w:t xml:space="preserve">.</w:t>
+        <w:t xml:space="preserve"> : commencer par [MOB-AUTH-10].</w:t>
       </w:r>
     </w:p>
     <w:p>
@@ -526,7 +484,7 @@
         <w:t xml:space="preserve">Préconditions :</w:t>
       </w:r>
       <w:r>
-        <w:t xml:space="preserve"> Écran de connexion affiché (</w:t>
+        <w:t xml:space="preserve"> Un compte a déjà été créé sur l'appareil ([MOB-AUTH-10]). Écran de connexion affiché (</w:t>
       </w:r>
       <w:r>
         <w:rPr>
@@ -578,7 +536,23 @@
         <w:t xml:space="preserve">login_email_field</w:t>
       </w:r>
       <w:r>
-        <w:t xml:space="preserve">) et saisir une adresse valide (ex. </w:t>
+        <w:t xml:space="preserve">) et saisir l'adresse du compte créé.</w:t>
+      </w:r>
+    </w:p>
+    <w:p>
+      <w:pPr>
+        <w:spacing w:after="80"/>
+        <w:ind w:left="360"/>
+      </w:pPr>
+      <w:r>
+        <w:rPr>
+          <w:b/>
+          <w:bCs/>
+        </w:rPr>
+        <w:t xml:space="preserve">2. </w:t>
+      </w:r>
+      <w:r>
+        <w:t xml:space="preserve">Taper dans le champ « Mot de passe » (</w:t>
       </w:r>
       <w:r>
         <w:rPr>
@@ -587,38 +561,10 @@
           <w:szCs w:val="20"/>
           <w:shd w:fill="EEEEEE" w:val="clear"/>
         </w:rPr>
-        <w:t xml:space="preserve">demo@ledgerhub.app</w:t>
-      </w:r>
-      <w:r>
-        <w:t xml:space="preserve">).</w:t>
-      </w:r>
-    </w:p>
-    <w:p>
-      <w:pPr>
-        <w:spacing w:after="80"/>
-        <w:ind w:left="360"/>
-      </w:pPr>
-      <w:r>
-        <w:rPr>
-          <w:b/>
-          <w:bCs/>
-        </w:rPr>
-        <w:t xml:space="preserve">2. </w:t>
-      </w:r>
-      <w:r>
-        <w:t xml:space="preserve">Taper dans le champ « Mot de passe » (</w:t>
-      </w:r>
-      <w:r>
-        <w:rPr>
-          <w:rFonts w:ascii="Consolas" w:cs="Consolas" w:eastAsia="Consolas" w:hAnsi="Consolas"/>
-          <w:sz w:val="20"/>
-          <w:szCs w:val="20"/>
-          <w:shd w:fill="EEEEEE" w:val="clear"/>
-        </w:rPr>
         <w:t xml:space="preserve">login_password_field</w:t>
       </w:r>
       <w:r>
-        <w:t xml:space="preserve">) et saisir un mot de passe quelconque non vide.</w:t>
+        <w:t xml:space="preserve">) et saisir son mot de passe.</w:t>
       </w:r>
     </w:p>
     <w:p>
@@ -696,7 +642,7 @@
         <w:t xml:space="preserve">login_loading_indicator</w:t>
       </w:r>
       <w:r>
-        <w:t xml:space="preserve">) apparaît brièvement pendant l'appel réseau.</w:t>
+        <w:t xml:space="preserve">) apparaît brièvement pendant la vérification.</w:t>
       </w:r>
     </w:p>
     <w:p>
@@ -709,196 +655,17 @@
         <w:spacing w:after="80"/>
       </w:pPr>
       <w:r>
-        <w:t xml:space="preserve">Résultat final : aucune erreur affichée ; le drapeau interne de succès est levé (à vérifier via le harnais, aucune navigation visible n'existe encore).</w:t>
-      </w:r>
-    </w:p>
-    <w:p>
-      <w:pPr>
-        <w:pStyle w:val="Heading2"/>
-        <w:spacing w:after="140" w:before="260"/>
-      </w:pPr>
-      <w:r>
-        <w:t xml:space="preserve">[MOB-AUTH-02] Connexion — champs vides</w:t>
-      </w:r>
-    </w:p>
-    <w:p>
-      <w:pPr>
-        <w:spacing w:after="120"/>
-      </w:pPr>
-      <w:r>
-        <w:rPr>
-          <w:b/>
-          <w:bCs/>
-        </w:rPr>
-        <w:t xml:space="preserve">Type :</w:t>
-      </w:r>
-      <w:r>
-        <w:t xml:space="preserve"> Non passant</w:t>
-      </w:r>
-    </w:p>
-    <w:p>
-      <w:pPr>
-        <w:spacing w:after="120"/>
-      </w:pPr>
-      <w:r>
-        <w:rPr>
-          <w:b/>
-          <w:bCs/>
-        </w:rPr>
-        <w:t xml:space="preserve">Préconditions :</w:t>
-      </w:r>
-      <w:r>
-        <w:t xml:space="preserve"> Écran de connexion affiché, champs vides.</w:t>
-      </w:r>
-    </w:p>
-    <w:p>
-      <w:pPr>
-        <w:spacing w:after="120"/>
-      </w:pPr>
-      <w:r>
-        <w:rPr>
-          <w:b/>
-          <w:bCs/>
-        </w:rPr>
-        <w:t xml:space="preserve">Actions :</w:t>
-      </w:r>
-    </w:p>
-    <w:p>
-      <w:pPr>
-        <w:spacing w:after="80"/>
-        <w:ind w:left="360"/>
-      </w:pPr>
-      <w:r>
-        <w:rPr>
-          <w:b/>
-          <w:bCs/>
-        </w:rPr>
-        <w:t xml:space="preserve">1. </w:t>
-      </w:r>
-      <w:r>
-        <w:t xml:space="preserve">Observer l'état du bouton « Se connecter » sans rien saisir.</w:t>
-      </w:r>
-    </w:p>
-    <w:p>
-      <w:pPr>
-        <w:spacing w:after="120"/>
-      </w:pPr>
-      <w:r>
-        <w:rPr>
-          <w:b/>
-          <w:bCs/>
-        </w:rPr>
-        <w:t xml:space="preserve">Résultat attendu :</w:t>
-      </w:r>
-      <w:r>
-        <w:t xml:space="preserve"> le bouton reste inerte (grisé ou sans effet au tap) : </w:t>
-      </w:r>
-      <w:r>
-        <w:rPr>
-          <w:rFonts w:ascii="Consolas" w:cs="Consolas" w:eastAsia="Consolas" w:hAnsi="Consolas"/>
-          <w:sz w:val="20"/>
-          <w:szCs w:val="20"/>
-          <w:shd w:fill="EEEEEE" w:val="clear"/>
-        </w:rPr>
-        <w:t xml:space="preserve">email.isNotBlank() &amp;&amp; password.isNotBlank()</w:t>
-      </w:r>
-      <w:r>
-        <w:t xml:space="preserve"> doit être faux.</w:t>
-      </w:r>
-    </w:p>
-    <w:p>
-      <w:pPr>
-        <w:pStyle w:val="Heading2"/>
-        <w:spacing w:after="140" w:before="260"/>
-      </w:pPr>
-      <w:r>
-        <w:t xml:space="preserve">[MOB-AUTH-03] Connexion — échec réseau / identifiants refusés</w:t>
-      </w:r>
-    </w:p>
-    <w:p>
-      <w:pPr>
-        <w:spacing w:after="120"/>
-      </w:pPr>
-      <w:r>
-        <w:rPr>
-          <w:b/>
-          <w:bCs/>
-        </w:rPr>
-        <w:t xml:space="preserve">Type :</w:t>
-      </w:r>
-      <w:r>
-        <w:t xml:space="preserve"> Non passant</w:t>
-      </w:r>
-    </w:p>
-    <w:p>
-      <w:pPr>
-        <w:spacing w:after="120"/>
-      </w:pPr>
-      <w:r>
-        <w:rPr>
-          <w:b/>
-          <w:bCs/>
-        </w:rPr>
-        <w:t xml:space="preserve">Préconditions :</w:t>
-      </w:r>
-      <w:r>
-        <w:t xml:space="preserve"> Écran de connexion, email/mot de passe saisis, backend configuré pour renvoyer une erreur (ou réseau coupé).</w:t>
-      </w:r>
-    </w:p>
-    <w:p>
-      <w:pPr>
-        <w:spacing w:after="120"/>
-      </w:pPr>
-      <w:r>
-        <w:rPr>
-          <w:b/>
-          <w:bCs/>
-        </w:rPr>
-        <w:t xml:space="preserve">Actions :</w:t>
-      </w:r>
-    </w:p>
-    <w:p>
-      <w:pPr>
-        <w:spacing w:after="80"/>
-        <w:ind w:left="360"/>
-      </w:pPr>
-      <w:r>
-        <w:rPr>
-          <w:b/>
-          <w:bCs/>
-        </w:rPr>
-        <w:t xml:space="preserve">1. </w:t>
-      </w:r>
-      <w:r>
-        <w:t xml:space="preserve">Saisir email et mot de passe.</w:t>
-      </w:r>
-    </w:p>
-    <w:p>
-      <w:pPr>
-        <w:spacing w:after="80"/>
-        <w:ind w:left="360"/>
-      </w:pPr>
-      <w:r>
-        <w:rPr>
-          <w:b/>
-          <w:bCs/>
-        </w:rPr>
-        <w:t xml:space="preserve">2. </w:t>
-      </w:r>
-      <w:r>
-        <w:t xml:space="preserve">Taper « Se connecter ».</w:t>
-      </w:r>
-    </w:p>
-    <w:p>
-      <w:pPr>
-        <w:spacing w:after="120"/>
-      </w:pPr>
-      <w:r>
-        <w:rPr>
-          <w:b/>
-          <w:bCs/>
-        </w:rPr>
-        <w:t xml:space="preserve">Résultat attendu :</w:t>
+        <w:t xml:space="preserve">Résultat final : aucune erreur affichée ; </w:t>
+      </w:r>
+      <w:r>
+        <w:rPr>
+          <w:b/>
+          <w:bCs/>
+        </w:rPr>
+        <w:t xml:space="preserve">le shell s'ouvre sur le tableau de bord</w:t>
+      </w:r>
+      <w:r>
+        <w:t xml:space="preserve">.</w:t>
       </w:r>
     </w:p>
     <w:p>
@@ -911,7 +678,240 @@
         <w:spacing w:after="80"/>
       </w:pPr>
       <w:r>
-        <w:t xml:space="preserve">L'indicateur de chargement disparaît.</w:t>
+        <w:t xml:space="preserve">La casse de l'adresse est sans effet : </w:t>
+      </w:r>
+      <w:r>
+        <w:rPr>
+          <w:rFonts w:ascii="Consolas" w:cs="Consolas" w:eastAsia="Consolas" w:hAnsi="Consolas"/>
+          <w:sz w:val="20"/>
+          <w:szCs w:val="20"/>
+          <w:shd w:fill="EEEEEE" w:val="clear"/>
+        </w:rPr>
+        <w:t xml:space="preserve">Vous@Cabinet.fr</w:t>
+      </w:r>
+      <w:r>
+        <w:t xml:space="preserve"> ouvre le même compte que </w:t>
+      </w:r>
+      <w:r>
+        <w:rPr>
+          <w:rFonts w:ascii="Consolas" w:cs="Consolas" w:eastAsia="Consolas" w:hAnsi="Consolas"/>
+          <w:sz w:val="20"/>
+          <w:szCs w:val="20"/>
+          <w:shd w:fill="EEEEEE" w:val="clear"/>
+        </w:rPr>
+        <w:t xml:space="preserve">vous@cabinet.fr</w:t>
+      </w:r>
+      <w:r>
+        <w:t xml:space="preserve">.</w:t>
+      </w:r>
+    </w:p>
+    <w:p>
+      <w:pPr>
+        <w:pStyle w:val="Heading2"/>
+        <w:spacing w:after="140" w:before="260"/>
+      </w:pPr>
+      <w:r>
+        <w:t xml:space="preserve">[MOB-AUTH-02] Connexion — champs vides</w:t>
+      </w:r>
+    </w:p>
+    <w:p>
+      <w:pPr>
+        <w:spacing w:after="120"/>
+      </w:pPr>
+      <w:r>
+        <w:rPr>
+          <w:b/>
+          <w:bCs/>
+        </w:rPr>
+        <w:t xml:space="preserve">Type :</w:t>
+      </w:r>
+      <w:r>
+        <w:t xml:space="preserve"> Non passant</w:t>
+      </w:r>
+    </w:p>
+    <w:p>
+      <w:pPr>
+        <w:spacing w:after="120"/>
+      </w:pPr>
+      <w:r>
+        <w:rPr>
+          <w:b/>
+          <w:bCs/>
+        </w:rPr>
+        <w:t xml:space="preserve">Préconditions :</w:t>
+      </w:r>
+      <w:r>
+        <w:t xml:space="preserve"> Écran de connexion affiché, champs vides.</w:t>
+      </w:r>
+    </w:p>
+    <w:p>
+      <w:pPr>
+        <w:spacing w:after="120"/>
+      </w:pPr>
+      <w:r>
+        <w:rPr>
+          <w:b/>
+          <w:bCs/>
+        </w:rPr>
+        <w:t xml:space="preserve">Actions :</w:t>
+      </w:r>
+    </w:p>
+    <w:p>
+      <w:pPr>
+        <w:spacing w:after="80"/>
+        <w:ind w:left="360"/>
+      </w:pPr>
+      <w:r>
+        <w:rPr>
+          <w:b/>
+          <w:bCs/>
+        </w:rPr>
+        <w:t xml:space="preserve">1. </w:t>
+      </w:r>
+      <w:r>
+        <w:t xml:space="preserve">Observer l'état du bouton « Se connecter » sans rien saisir.</w:t>
+      </w:r>
+    </w:p>
+    <w:p>
+      <w:pPr>
+        <w:spacing w:after="120"/>
+      </w:pPr>
+      <w:r>
+        <w:rPr>
+          <w:b/>
+          <w:bCs/>
+        </w:rPr>
+        <w:t xml:space="preserve">Résultat attendu :</w:t>
+      </w:r>
+      <w:r>
+        <w:t xml:space="preserve"> le bouton reste inerte (grisé ou sans effet au tap) : </w:t>
+      </w:r>
+      <w:r>
+        <w:rPr>
+          <w:rFonts w:ascii="Consolas" w:cs="Consolas" w:eastAsia="Consolas" w:hAnsi="Consolas"/>
+          <w:sz w:val="20"/>
+          <w:szCs w:val="20"/>
+          <w:shd w:fill="EEEEEE" w:val="clear"/>
+        </w:rPr>
+        <w:t xml:space="preserve">email.isNotBlank() &amp;&amp; password.isNotBlank()</w:t>
+      </w:r>
+      <w:r>
+        <w:t xml:space="preserve"> doit être faux.</w:t>
+      </w:r>
+    </w:p>
+    <w:p>
+      <w:pPr>
+        <w:pStyle w:val="Heading2"/>
+        <w:spacing w:after="140" w:before="260"/>
+      </w:pPr>
+      <w:r>
+        <w:t xml:space="preserve">[MOB-AUTH-03] Connexion — identifiants refusés</w:t>
+      </w:r>
+    </w:p>
+    <w:p>
+      <w:pPr>
+        <w:spacing w:after="120"/>
+      </w:pPr>
+      <w:r>
+        <w:rPr>
+          <w:b/>
+          <w:bCs/>
+        </w:rPr>
+        <w:t xml:space="preserve">Type :</w:t>
+      </w:r>
+      <w:r>
+        <w:t xml:space="preserve"> Non passant</w:t>
+      </w:r>
+    </w:p>
+    <w:p>
+      <w:pPr>
+        <w:spacing w:after="120"/>
+      </w:pPr>
+      <w:r>
+        <w:rPr>
+          <w:b/>
+          <w:bCs/>
+        </w:rPr>
+        <w:t xml:space="preserve">Préconditions :</w:t>
+      </w:r>
+      <w:r>
+        <w:t xml:space="preserve"> Écran de connexion. Deux passes : (a) une adresse </w:t>
+      </w:r>
+      <w:r>
+        <w:rPr>
+          <w:b/>
+          <w:bCs/>
+        </w:rPr>
+        <w:t xml:space="preserve">inconnue</w:t>
+      </w:r>
+      <w:r>
+        <w:t xml:space="preserve"> de l'appareil ; (b) l'adresse d'un compte existant avec un </w:t>
+      </w:r>
+      <w:r>
+        <w:rPr>
+          <w:b/>
+          <w:bCs/>
+        </w:rPr>
+        <w:t xml:space="preserve">mauvais</w:t>
+      </w:r>
+      <w:r>
+        <w:t xml:space="preserve"> mot de passe.</w:t>
+      </w:r>
+    </w:p>
+    <w:p>
+      <w:pPr>
+        <w:spacing w:after="120"/>
+      </w:pPr>
+      <w:r>
+        <w:rPr>
+          <w:b/>
+          <w:bCs/>
+        </w:rPr>
+        <w:t xml:space="preserve">Actions :</w:t>
+      </w:r>
+    </w:p>
+    <w:p>
+      <w:pPr>
+        <w:spacing w:after="80"/>
+        <w:ind w:left="360"/>
+      </w:pPr>
+      <w:r>
+        <w:rPr>
+          <w:b/>
+          <w:bCs/>
+        </w:rPr>
+        <w:t xml:space="preserve">1. </w:t>
+      </w:r>
+      <w:r>
+        <w:t xml:space="preserve">Saisir email et mot de passe.</w:t>
+      </w:r>
+    </w:p>
+    <w:p>
+      <w:pPr>
+        <w:spacing w:after="80"/>
+        <w:ind w:left="360"/>
+      </w:pPr>
+      <w:r>
+        <w:rPr>
+          <w:b/>
+          <w:bCs/>
+        </w:rPr>
+        <w:t xml:space="preserve">2. </w:t>
+      </w:r>
+      <w:r>
+        <w:t xml:space="preserve">Taper « Se connecter ».</w:t>
+      </w:r>
+    </w:p>
+    <w:p>
+      <w:pPr>
+        <w:spacing w:after="120"/>
+      </w:pPr>
+      <w:r>
+        <w:rPr>
+          <w:b/>
+          <w:bCs/>
+        </w:rPr>
+        <w:t xml:space="preserve">Résultat attendu :</w:t>
       </w:r>
     </w:p>
     <w:p>
@@ -924,19 +924,17 @@
         <w:spacing w:after="80"/>
       </w:pPr>
       <w:r>
-        <w:t xml:space="preserve">Un message d'erreur apparaît dans </w:t>
-      </w:r>
-      <w:r>
-        <w:rPr>
-          <w:rFonts w:ascii="Consolas" w:cs="Consolas" w:eastAsia="Consolas" w:hAnsi="Consolas"/>
-          <w:sz w:val="20"/>
-          <w:szCs w:val="20"/>
-          <w:shd w:fill="EEEEEE" w:val="clear"/>
-        </w:rPr>
-        <w:t xml:space="preserve">login_error_message</w:t>
-      </w:r>
-      <w:r>
-        <w:t xml:space="preserve"> (message du serveur, ou repli « Erreur inconnue lors de la connexion » si le serveur ne fournit aucun détail).</w:t>
+        <w:t xml:space="preserve">L'indicateur de chargement disparaît, le shell </w:t>
+      </w:r>
+      <w:r>
+        <w:rPr>
+          <w:b/>
+          <w:bCs/>
+        </w:rPr>
+        <w:t xml:space="preserve">ne s'ouvre pas</w:t>
+      </w:r>
+      <w:r>
+        <w:t xml:space="preserve">.</w:t>
       </w:r>
     </w:p>
     <w:p>
@@ -949,74 +947,7 @@
         <w:spacing w:after="80"/>
       </w:pPr>
       <w:r>
-        <w:t xml:space="preserve">Les champs saisis restent affichés (rien n'est effacé) pour permettre une nouvelle tentative.</w:t>
-      </w:r>
-    </w:p>
-    <w:p>
-      <w:pPr>
-        <w:pStyle w:val="Heading2"/>
-        <w:spacing w:after="140" w:before="260"/>
-      </w:pPr>
-      <w:r>
-        <w:t xml:space="preserve">[MOB-AUTH-04] Bascule vers l'inscription</w:t>
-      </w:r>
-    </w:p>
-    <w:p>
-      <w:pPr>
-        <w:spacing w:after="120"/>
-      </w:pPr>
-      <w:r>
-        <w:rPr>
-          <w:b/>
-          <w:bCs/>
-        </w:rPr>
-        <w:t xml:space="preserve">Type :</w:t>
-      </w:r>
-      <w:r>
-        <w:t xml:space="preserve"> Passant</w:t>
-      </w:r>
-    </w:p>
-    <w:p>
-      <w:pPr>
-        <w:spacing w:after="120"/>
-      </w:pPr>
-      <w:r>
-        <w:rPr>
-          <w:b/>
-          <w:bCs/>
-        </w:rPr>
-        <w:t xml:space="preserve">Préconditions :</w:t>
-      </w:r>
-      <w:r>
-        <w:t xml:space="preserve"> Onglet « Connexion » actif.</w:t>
-      </w:r>
-    </w:p>
-    <w:p>
-      <w:pPr>
-        <w:spacing w:after="120"/>
-      </w:pPr>
-      <w:r>
-        <w:rPr>
-          <w:b/>
-          <w:bCs/>
-        </w:rPr>
-        <w:t xml:space="preserve">Actions :</w:t>
-      </w:r>
-    </w:p>
-    <w:p>
-      <w:pPr>
-        <w:spacing w:after="80"/>
-        <w:ind w:left="360"/>
-      </w:pPr>
-      <w:r>
-        <w:rPr>
-          <w:b/>
-          <w:bCs/>
-        </w:rPr>
-        <w:t xml:space="preserve">1. </w:t>
-      </w:r>
-      <w:r>
-        <w:t xml:space="preserve">Taper « Pas encore de compte ? S'inscrire » (</w:t>
+        <w:t xml:space="preserve">Le message « Identifiants invalides » apparaît dans </w:t>
       </w:r>
       <w:r>
         <w:rPr>
@@ -1025,144 +956,10 @@
           <w:szCs w:val="20"/>
           <w:shd w:fill="EEEEEE" w:val="clear"/>
         </w:rPr>
-        <w:t xml:space="preserve">login_register_link</w:t>
-      </w:r>
-      <w:r>
-        <w:t xml:space="preserve">) ou l'onglet « Inscription » (</w:t>
-      </w:r>
-      <w:r>
-        <w:rPr>
-          <w:rFonts w:ascii="Consolas" w:cs="Consolas" w:eastAsia="Consolas" w:hAnsi="Consolas"/>
-          <w:sz w:val="20"/>
-          <w:szCs w:val="20"/>
-          <w:shd w:fill="EEEEEE" w:val="clear"/>
-        </w:rPr>
-        <w:t xml:space="preserve">auth_tab_register</w:t>
-      </w:r>
-      <w:r>
-        <w:t xml:space="preserve">).</w:t>
-      </w:r>
-    </w:p>
-    <w:p>
-      <w:pPr>
-        <w:spacing w:after="120"/>
-      </w:pPr>
-      <w:r>
-        <w:rPr>
-          <w:b/>
-          <w:bCs/>
-        </w:rPr>
-        <w:t xml:space="preserve">Résultat attendu :</w:t>
-      </w:r>
-      <w:r>
-        <w:t xml:space="preserve"> le formulaire bascule sur les champs d'inscription : SIRET, Raison sociale (auto-complétée), Email, Mot de passe. Le titre affiche « Créer votre espace LedgerHub » / sous-titre « Votre SIRET suffit, nous récupérons le reste ».</w:t>
-      </w:r>
-    </w:p>
-    <w:p>
-      <w:pPr>
-        <w:pStyle w:val="Heading2"/>
-        <w:spacing w:after="140" w:before="260"/>
-      </w:pPr>
-      <w:r>
-        <w:t xml:space="preserve">[MOB-AUTH-05] Inscription — vérification SIRENE automatique et réussie</w:t>
-      </w:r>
-    </w:p>
-    <w:p>
-      <w:pPr>
-        <w:spacing w:after="120"/>
-      </w:pPr>
-      <w:r>
-        <w:rPr>
-          <w:b/>
-          <w:bCs/>
-        </w:rPr>
-        <w:t xml:space="preserve">Type :</w:t>
-      </w:r>
-      <w:r>
-        <w:t xml:space="preserve"> Passant</w:t>
-      </w:r>
-    </w:p>
-    <w:p>
-      <w:pPr>
-        <w:spacing w:after="120"/>
-      </w:pPr>
-      <w:r>
-        <w:rPr>
-          <w:b/>
-          <w:bCs/>
-        </w:rPr>
-        <w:t xml:space="preserve">Préconditions :</w:t>
-      </w:r>
-      <w:r>
-        <w:t xml:space="preserve"> Onglet « Inscription » actif, champ SIRET vide.</w:t>
-      </w:r>
-    </w:p>
-    <w:p>
-      <w:pPr>
-        <w:spacing w:after="120"/>
-      </w:pPr>
-      <w:r>
-        <w:rPr>
-          <w:b/>
-          <w:bCs/>
-        </w:rPr>
-        <w:t xml:space="preserve">Actions :</w:t>
-      </w:r>
-    </w:p>
-    <w:p>
-      <w:pPr>
-        <w:spacing w:after="80"/>
-        <w:ind w:left="360"/>
-      </w:pPr>
-      <w:r>
-        <w:rPr>
-          <w:b/>
-          <w:bCs/>
-        </w:rPr>
-        <w:t xml:space="preserve">1. </w:t>
-      </w:r>
-      <w:r>
-        <w:t xml:space="preserve">Taper dans le champ SIRET (</w:t>
-      </w:r>
-      <w:r>
-        <w:rPr>
-          <w:rFonts w:ascii="Consolas" w:cs="Consolas" w:eastAsia="Consolas" w:hAnsi="Consolas"/>
-          <w:sz w:val="20"/>
-          <w:szCs w:val="20"/>
-          <w:shd w:fill="EEEEEE" w:val="clear"/>
-        </w:rPr>
-        <w:t xml:space="preserve">auth_siret_input</w:t>
-      </w:r>
-      <w:r>
-        <w:t xml:space="preserve">) et saisir progressivement les 14 chiffres du SIRET de démonstration.</w:t>
-      </w:r>
-    </w:p>
-    <w:p>
-      <w:pPr>
-        <w:spacing w:after="80"/>
-        <w:ind w:left="360"/>
-      </w:pPr>
-      <w:r>
-        <w:rPr>
-          <w:b/>
-          <w:bCs/>
-        </w:rPr>
-        <w:t xml:space="preserve">2. </w:t>
-      </w:r>
-      <w:r>
-        <w:t xml:space="preserve">Ne rien taper d'autre : observer le déclenchement automatique de la vérification dès le 14ᵉ chiffre.</w:t>
-      </w:r>
-    </w:p>
-    <w:p>
-      <w:pPr>
-        <w:spacing w:after="120"/>
-      </w:pPr>
-      <w:r>
-        <w:rPr>
-          <w:b/>
-          <w:bCs/>
-        </w:rPr>
-        <w:t xml:space="preserve">Résultat attendu :</w:t>
+        <w:t xml:space="preserve">login_error_message</w:t>
+      </w:r>
+      <w:r>
+        <w:t xml:space="preserve">.</w:t>
       </w:r>
     </w:p>
     <w:p>
@@ -1175,7 +972,14 @@
         <w:spacing w:after="80"/>
       </w:pPr>
       <w:r>
-        <w:t xml:space="preserve">Après le 13ᵉ chiffre : aucune vérification ne démarre.</w:t>
+        <w:rPr>
+          <w:b/>
+          <w:bCs/>
+        </w:rPr>
+        <w:t xml:space="preserve">Le message est le même dans les deux passes</w:t>
+      </w:r>
+      <w:r>
+        <w:t xml:space="preserve"> : l'application ne doit jamais révéler quelles adresses portent un compte sur l'appareil.</w:t>
       </w:r>
     </w:p>
     <w:p>
@@ -1188,7 +992,74 @@
         <w:spacing w:after="80"/>
       </w:pPr>
       <w:r>
-        <w:t xml:space="preserve">Dès le 14ᵉ chiffre (aucun bouton à presser) : un indicateur de chargement (</w:t>
+        <w:t xml:space="preserve">Les champs saisis restent affichés (rien n'est effacé) pour permettre une nouvelle tentative.</w:t>
+      </w:r>
+    </w:p>
+    <w:p>
+      <w:pPr>
+        <w:pStyle w:val="Heading2"/>
+        <w:spacing w:after="140" w:before="260"/>
+      </w:pPr>
+      <w:r>
+        <w:t xml:space="preserve">[MOB-AUTH-04] Bascule vers l'inscription</w:t>
+      </w:r>
+    </w:p>
+    <w:p>
+      <w:pPr>
+        <w:spacing w:after="120"/>
+      </w:pPr>
+      <w:r>
+        <w:rPr>
+          <w:b/>
+          <w:bCs/>
+        </w:rPr>
+        <w:t xml:space="preserve">Type :</w:t>
+      </w:r>
+      <w:r>
+        <w:t xml:space="preserve"> Passant</w:t>
+      </w:r>
+    </w:p>
+    <w:p>
+      <w:pPr>
+        <w:spacing w:after="120"/>
+      </w:pPr>
+      <w:r>
+        <w:rPr>
+          <w:b/>
+          <w:bCs/>
+        </w:rPr>
+        <w:t xml:space="preserve">Préconditions :</w:t>
+      </w:r>
+      <w:r>
+        <w:t xml:space="preserve"> Onglet « Connexion » actif.</w:t>
+      </w:r>
+    </w:p>
+    <w:p>
+      <w:pPr>
+        <w:spacing w:after="120"/>
+      </w:pPr>
+      <w:r>
+        <w:rPr>
+          <w:b/>
+          <w:bCs/>
+        </w:rPr>
+        <w:t xml:space="preserve">Actions :</w:t>
+      </w:r>
+    </w:p>
+    <w:p>
+      <w:pPr>
+        <w:spacing w:after="80"/>
+        <w:ind w:left="360"/>
+      </w:pPr>
+      <w:r>
+        <w:rPr>
+          <w:b/>
+          <w:bCs/>
+        </w:rPr>
+        <w:t xml:space="preserve">1. </w:t>
+      </w:r>
+      <w:r>
+        <w:t xml:space="preserve">Taper « Pas encore de compte ? S'inscrire » (</w:t>
       </w:r>
       <w:r>
         <w:rPr>
@@ -1197,10 +1068,144 @@
           <w:szCs w:val="20"/>
           <w:shd w:fill="EEEEEE" w:val="clear"/>
         </w:rPr>
-        <w:t xml:space="preserve">auth_siret_loader</w:t>
-      </w:r>
-      <w:r>
-        <w:t xml:space="preserve">) apparaît avec le message « Vérification auprès de l'API SIRENE… ».</w:t>
+        <w:t xml:space="preserve">login_register_link</w:t>
+      </w:r>
+      <w:r>
+        <w:t xml:space="preserve">) ou l'onglet « Inscription » (</w:t>
+      </w:r>
+      <w:r>
+        <w:rPr>
+          <w:rFonts w:ascii="Consolas" w:cs="Consolas" w:eastAsia="Consolas" w:hAnsi="Consolas"/>
+          <w:sz w:val="20"/>
+          <w:szCs w:val="20"/>
+          <w:shd w:fill="EEEEEE" w:val="clear"/>
+        </w:rPr>
+        <w:t xml:space="preserve">auth_tab_register</w:t>
+      </w:r>
+      <w:r>
+        <w:t xml:space="preserve">).</w:t>
+      </w:r>
+    </w:p>
+    <w:p>
+      <w:pPr>
+        <w:spacing w:after="120"/>
+      </w:pPr>
+      <w:r>
+        <w:rPr>
+          <w:b/>
+          <w:bCs/>
+        </w:rPr>
+        <w:t xml:space="preserve">Résultat attendu :</w:t>
+      </w:r>
+      <w:r>
+        <w:t xml:space="preserve"> le formulaire bascule sur les champs d'inscription : SIRET, Raison sociale (auto-complétée), Email, Mot de passe. Le titre affiche « Créer votre espace LedgerHub » / sous-titre « Votre SIRET suffit, nous récupérons le reste ».</w:t>
+      </w:r>
+    </w:p>
+    <w:p>
+      <w:pPr>
+        <w:pStyle w:val="Heading2"/>
+        <w:spacing w:after="140" w:before="260"/>
+      </w:pPr>
+      <w:r>
+        <w:t xml:space="preserve">[MOB-AUTH-05] Inscription — vérification SIRENE automatique et réussie</w:t>
+      </w:r>
+    </w:p>
+    <w:p>
+      <w:pPr>
+        <w:spacing w:after="120"/>
+      </w:pPr>
+      <w:r>
+        <w:rPr>
+          <w:b/>
+          <w:bCs/>
+        </w:rPr>
+        <w:t xml:space="preserve">Type :</w:t>
+      </w:r>
+      <w:r>
+        <w:t xml:space="preserve"> Passant</w:t>
+      </w:r>
+    </w:p>
+    <w:p>
+      <w:pPr>
+        <w:spacing w:after="120"/>
+      </w:pPr>
+      <w:r>
+        <w:rPr>
+          <w:b/>
+          <w:bCs/>
+        </w:rPr>
+        <w:t xml:space="preserve">Préconditions :</w:t>
+      </w:r>
+      <w:r>
+        <w:t xml:space="preserve"> Onglet « Inscription » actif, champ SIRET vide.</w:t>
+      </w:r>
+    </w:p>
+    <w:p>
+      <w:pPr>
+        <w:spacing w:after="120"/>
+      </w:pPr>
+      <w:r>
+        <w:rPr>
+          <w:b/>
+          <w:bCs/>
+        </w:rPr>
+        <w:t xml:space="preserve">Actions :</w:t>
+      </w:r>
+    </w:p>
+    <w:p>
+      <w:pPr>
+        <w:spacing w:after="80"/>
+        <w:ind w:left="360"/>
+      </w:pPr>
+      <w:r>
+        <w:rPr>
+          <w:b/>
+          <w:bCs/>
+        </w:rPr>
+        <w:t xml:space="preserve">1. </w:t>
+      </w:r>
+      <w:r>
+        <w:t xml:space="preserve">Taper dans le champ SIRET (</w:t>
+      </w:r>
+      <w:r>
+        <w:rPr>
+          <w:rFonts w:ascii="Consolas" w:cs="Consolas" w:eastAsia="Consolas" w:hAnsi="Consolas"/>
+          <w:sz w:val="20"/>
+          <w:szCs w:val="20"/>
+          <w:shd w:fill="EEEEEE" w:val="clear"/>
+        </w:rPr>
+        <w:t xml:space="preserve">auth_siret_input</w:t>
+      </w:r>
+      <w:r>
+        <w:t xml:space="preserve">) et saisir progressivement les 14 chiffres du SIRET de démonstration.</w:t>
+      </w:r>
+    </w:p>
+    <w:p>
+      <w:pPr>
+        <w:spacing w:after="80"/>
+        <w:ind w:left="360"/>
+      </w:pPr>
+      <w:r>
+        <w:rPr>
+          <w:b/>
+          <w:bCs/>
+        </w:rPr>
+        <w:t xml:space="preserve">2. </w:t>
+      </w:r>
+      <w:r>
+        <w:t xml:space="preserve">Ne rien taper d'autre : observer le déclenchement automatique de la vérification dès le 14ᵉ chiffre.</w:t>
+      </w:r>
+    </w:p>
+    <w:p>
+      <w:pPr>
+        <w:spacing w:after="120"/>
+      </w:pPr>
+      <w:r>
+        <w:rPr>
+          <w:b/>
+          <w:bCs/>
+        </w:rPr>
+        <w:t xml:space="preserve">Résultat attendu :</w:t>
       </w:r>
     </w:p>
     <w:p>
@@ -1213,19 +1218,7 @@
         <w:spacing w:after="80"/>
       </w:pPr>
       <w:r>
-        <w:t xml:space="preserve">Sous ~1 seconde : le badge vert « ✓ Entreprise vérifiée via l'API SIRENE » (</w:t>
-      </w:r>
-      <w:r>
-        <w:rPr>
-          <w:rFonts w:ascii="Consolas" w:cs="Consolas" w:eastAsia="Consolas" w:hAnsi="Consolas"/>
-          <w:sz w:val="20"/>
-          <w:szCs w:val="20"/>
-          <w:shd w:fill="EEEEEE" w:val="clear"/>
-        </w:rPr>
-        <w:t xml:space="preserve">auth_sirene_verified_badge</w:t>
-      </w:r>
-      <w:r>
-        <w:t xml:space="preserve">) s'affiche.</w:t>
+        <w:t xml:space="preserve">Après le 13ᵉ chiffre : aucune vérification ne démarre.</w:t>
       </w:r>
     </w:p>
     <w:p>
@@ -1238,7 +1231,7 @@
         <w:spacing w:after="80"/>
       </w:pPr>
       <w:r>
-        <w:t xml:space="preserve">Le champ « Raison sociale » (</w:t>
+        <w:t xml:space="preserve">Dès le 14ᵉ chiffre (aucun bouton à presser) : un indicateur de chargement (</w:t>
       </w:r>
       <w:r>
         <w:rPr>
@@ -1247,10 +1240,10 @@
           <w:szCs w:val="20"/>
           <w:shd w:fill="EEEEEE" w:val="clear"/>
         </w:rPr>
-        <w:t xml:space="preserve">auth_company_name_input</w:t>
-      </w:r>
-      <w:r>
-        <w:t xml:space="preserve">) se remplit automatiquement avec le nom retourné.</w:t>
+        <w:t xml:space="preserve">auth_siret_loader</w:t>
+      </w:r>
+      <w:r>
+        <w:t xml:space="preserve">) apparaît avec le message « Vérification auprès de l'API SIRENE… ».</w:t>
       </w:r>
     </w:p>
     <w:p>
@@ -1263,358 +1256,19 @@
         <w:spacing w:after="80"/>
       </w:pPr>
       <w:r>
-        <w:t xml:space="preserve">Le bouton « Créer mon espace » devient actif (il était inerte tant que la vérification n'avait pas abouti).</w:t>
-      </w:r>
-    </w:p>
-    <w:p>
-      <w:pPr>
-        <w:pStyle w:val="Heading2"/>
-        <w:spacing w:after="140" w:before="260"/>
-      </w:pPr>
-      <w:r>
-        <w:t xml:space="preserve">[MOB-AUTH-06] Inscription — SIRET introuvable</w:t>
-      </w:r>
-    </w:p>
-    <w:p>
-      <w:pPr>
-        <w:spacing w:after="120"/>
-      </w:pPr>
-      <w:r>
-        <w:rPr>
-          <w:b/>
-          <w:bCs/>
-        </w:rPr>
-        <w:t xml:space="preserve">Type :</w:t>
-      </w:r>
-      <w:r>
-        <w:t xml:space="preserve"> Non passant</w:t>
-      </w:r>
-    </w:p>
-    <w:p>
-      <w:pPr>
-        <w:spacing w:after="120"/>
-      </w:pPr>
-      <w:r>
-        <w:rPr>
-          <w:b/>
-          <w:bCs/>
-        </w:rPr>
-        <w:t xml:space="preserve">Préconditions :</w:t>
-      </w:r>
-      <w:r>
-        <w:t xml:space="preserve"> Onglet « Inscription », champ SIRET vide.</w:t>
-      </w:r>
-    </w:p>
-    <w:p>
-      <w:pPr>
-        <w:spacing w:after="120"/>
-      </w:pPr>
-      <w:r>
-        <w:rPr>
-          <w:b/>
-          <w:bCs/>
-        </w:rPr>
-        <w:t xml:space="preserve">Actions :</w:t>
-      </w:r>
-    </w:p>
-    <w:p>
-      <w:pPr>
-        <w:spacing w:after="80"/>
-        <w:ind w:left="360"/>
-      </w:pPr>
-      <w:r>
-        <w:rPr>
-          <w:b/>
-          <w:bCs/>
-        </w:rPr>
-        <w:t xml:space="preserve">1. </w:t>
-      </w:r>
-      <w:r>
-        <w:t xml:space="preserve">Saisir 14 chiffres ne correspondant à aucune entreprise connue du répertoire SIRENE simulé.</w:t>
-      </w:r>
-    </w:p>
-    <w:p>
-      <w:pPr>
-        <w:spacing w:after="120"/>
-      </w:pPr>
-      <w:r>
-        <w:rPr>
-          <w:b/>
-          <w:bCs/>
-        </w:rPr>
-        <w:t xml:space="preserve">Résultat attendu :</w:t>
-      </w:r>
-      <w:r>
-        <w:t xml:space="preserve"> le message « SIRET introuvable au répertoire SIRENE. » remplace le badge vert ; le champ Raison sociale reste vide ; le bouton « Créer mon espace » reste inerte.</w:t>
-      </w:r>
-    </w:p>
-    <w:p>
-      <w:pPr>
-        <w:pStyle w:val="Heading2"/>
-        <w:spacing w:after="140" w:before="260"/>
-      </w:pPr>
-      <w:r>
-        <w:t xml:space="preserve">[MOB-AUTH-07] Inscription — répertoire SIRENE indisponible</w:t>
-      </w:r>
-    </w:p>
-    <w:p>
-      <w:pPr>
-        <w:spacing w:after="120"/>
-      </w:pPr>
-      <w:r>
-        <w:rPr>
-          <w:b/>
-          <w:bCs/>
-        </w:rPr>
-        <w:t xml:space="preserve">Type :</w:t>
-      </w:r>
-      <w:r>
-        <w:t xml:space="preserve"> Non passant</w:t>
-      </w:r>
-    </w:p>
-    <w:p>
-      <w:pPr>
-        <w:spacing w:after="120"/>
-      </w:pPr>
-      <w:r>
-        <w:rPr>
-          <w:b/>
-          <w:bCs/>
-        </w:rPr>
-        <w:t xml:space="preserve">Préconditions :</w:t>
-      </w:r>
-      <w:r>
-        <w:t xml:space="preserve"> Service de vérification SIRENE simulé en panne (harnais de test).</w:t>
-      </w:r>
-    </w:p>
-    <w:p>
-      <w:pPr>
-        <w:spacing w:after="120"/>
-      </w:pPr>
-      <w:r>
-        <w:rPr>
-          <w:b/>
-          <w:bCs/>
-        </w:rPr>
-        <w:t xml:space="preserve">Actions :</w:t>
-      </w:r>
-    </w:p>
-    <w:p>
-      <w:pPr>
-        <w:spacing w:after="80"/>
-        <w:ind w:left="360"/>
-      </w:pPr>
-      <w:r>
-        <w:rPr>
-          <w:b/>
-          <w:bCs/>
-        </w:rPr>
-        <w:t xml:space="preserve">1. </w:t>
-      </w:r>
-      <w:r>
-        <w:t xml:space="preserve">Saisir un SIRET à 14 chiffres.</w:t>
-      </w:r>
-    </w:p>
-    <w:p>
-      <w:pPr>
-        <w:spacing w:after="120"/>
-      </w:pPr>
-      <w:r>
-        <w:rPr>
-          <w:b/>
-          <w:bCs/>
-        </w:rPr>
-        <w:t xml:space="preserve">Résultat attendu :</w:t>
-      </w:r>
-      <w:r>
-        <w:t xml:space="preserve"> message distinct des deux précédents — « Répertoire SIRENE indisponible, réessayez. » — pour ne pas laisser croire à tort que le SIRET est invalide.</w:t>
-      </w:r>
-    </w:p>
-    <w:p>
-      <w:pPr>
-        <w:pStyle w:val="Heading2"/>
-        <w:spacing w:after="140" w:before="260"/>
-      </w:pPr>
-      <w:r>
-        <w:t xml:space="preserve">[MOB-AUTH-08] Inscription — correction du SIRET pendant une vérification en cours</w:t>
-      </w:r>
-    </w:p>
-    <w:p>
-      <w:pPr>
-        <w:spacing w:after="120"/>
-      </w:pPr>
-      <w:r>
-        <w:rPr>
-          <w:b/>
-          <w:bCs/>
-        </w:rPr>
-        <w:t xml:space="preserve">Type :</w:t>
-      </w:r>
-      <w:r>
-        <w:t xml:space="preserve"> Non passant / cas limite</w:t>
-      </w:r>
-    </w:p>
-    <w:p>
-      <w:pPr>
-        <w:spacing w:after="120"/>
-      </w:pPr>
-      <w:r>
-        <w:rPr>
-          <w:b/>
-          <w:bCs/>
-        </w:rPr>
-        <w:t xml:space="preserve">Préconditions :</w:t>
-      </w:r>
-      <w:r>
-        <w:t xml:space="preserve"> Onglet « Inscription ».</w:t>
-      </w:r>
-    </w:p>
-    <w:p>
-      <w:pPr>
-        <w:spacing w:after="120"/>
-      </w:pPr>
-      <w:r>
-        <w:rPr>
-          <w:b/>
-          <w:bCs/>
-        </w:rPr>
-        <w:t xml:space="preserve">Actions :</w:t>
-      </w:r>
-    </w:p>
-    <w:p>
-      <w:pPr>
-        <w:spacing w:after="80"/>
-        <w:ind w:left="360"/>
-      </w:pPr>
-      <w:r>
-        <w:rPr>
-          <w:b/>
-          <w:bCs/>
-        </w:rPr>
-        <w:t xml:space="preserve">1. </w:t>
-      </w:r>
-      <w:r>
-        <w:t xml:space="preserve">Saisir rapidement 14 chiffres, puis avant l'affichage du résultat, effacer un chiffre et le remplacer par un autre (nouveau SIRET à 14 chiffres).</w:t>
-      </w:r>
-    </w:p>
-    <w:p>
-      <w:pPr>
-        <w:spacing w:after="120"/>
-      </w:pPr>
-      <w:r>
-        <w:rPr>
-          <w:b/>
-          <w:bCs/>
-        </w:rPr>
-        <w:t xml:space="preserve">Résultat attendu :</w:t>
-      </w:r>
-      <w:r>
-        <w:t xml:space="preserve"> seul le résultat de la </w:t>
-      </w:r>
-      <w:r>
-        <w:rPr>
-          <w:b/>
-          <w:bCs/>
-        </w:rPr>
-        <w:t xml:space="preserve">dernière</w:t>
-      </w:r>
-      <w:r>
-        <w:t xml:space="preserve"> saisie s'affiche ; aucun résultat obsolète de la première vérification n'apparaît après coup (annulation de la requête en vol).</w:t>
-      </w:r>
-    </w:p>
-    <w:p>
-      <w:pPr>
-        <w:pStyle w:val="Heading2"/>
-        <w:spacing w:after="140" w:before="260"/>
-      </w:pPr>
-      <w:r>
-        <w:t xml:space="preserve">[MOB-AUTH-09] Inscription — nom auto-rempli puis modifié manuellement</w:t>
-      </w:r>
-    </w:p>
-    <w:p>
-      <w:pPr>
-        <w:spacing w:after="120"/>
-      </w:pPr>
-      <w:r>
-        <w:rPr>
-          <w:b/>
-          <w:bCs/>
-        </w:rPr>
-        <w:t xml:space="preserve">Type :</w:t>
-      </w:r>
-      <w:r>
-        <w:t xml:space="preserve"> Passant</w:t>
-      </w:r>
-    </w:p>
-    <w:p>
-      <w:pPr>
-        <w:spacing w:after="120"/>
-      </w:pPr>
-      <w:r>
-        <w:rPr>
-          <w:b/>
-          <w:bCs/>
-        </w:rPr>
-        <w:t xml:space="preserve">Préconditions :</w:t>
-      </w:r>
-      <w:r>
-        <w:t xml:space="preserve"> SIRET vérifié avec succès, champ Raison sociale auto-rempli.</w:t>
-      </w:r>
-    </w:p>
-    <w:p>
-      <w:pPr>
-        <w:spacing w:after="120"/>
-      </w:pPr>
-      <w:r>
-        <w:rPr>
-          <w:b/>
-          <w:bCs/>
-        </w:rPr>
-        <w:t xml:space="preserve">Actions :</w:t>
-      </w:r>
-    </w:p>
-    <w:p>
-      <w:pPr>
-        <w:spacing w:after="80"/>
-        <w:ind w:left="360"/>
-      </w:pPr>
-      <w:r>
-        <w:rPr>
-          <w:b/>
-          <w:bCs/>
-        </w:rPr>
-        <w:t xml:space="preserve">1. </w:t>
-      </w:r>
-      <w:r>
-        <w:t xml:space="preserve">Taper dans le champ Raison sociale et modifier le texte auto-rempli.</w:t>
-      </w:r>
-    </w:p>
-    <w:p>
-      <w:pPr>
-        <w:spacing w:after="80"/>
-        <w:ind w:left="360"/>
-      </w:pPr>
-      <w:r>
-        <w:rPr>
-          <w:b/>
-          <w:bCs/>
-        </w:rPr>
-        <w:t xml:space="preserve">2. </w:t>
-      </w:r>
-      <w:r>
-        <w:t xml:space="preserve">Effacer un chiffre du SIRET (le faisant repasser sous 14 chiffres) puis le ressaisir.</w:t>
-      </w:r>
-    </w:p>
-    <w:p>
-      <w:pPr>
-        <w:spacing w:after="120"/>
-      </w:pPr>
-      <w:r>
-        <w:rPr>
-          <w:b/>
-          <w:bCs/>
-        </w:rPr>
-        <w:t xml:space="preserve">Résultat attendu :</w:t>
+        <w:t xml:space="preserve">Sous ~1 seconde : le badge vert « ✓ Entreprise vérifiée via l'API SIRENE » (</w:t>
+      </w:r>
+      <w:r>
+        <w:rPr>
+          <w:rFonts w:ascii="Consolas" w:cs="Consolas" w:eastAsia="Consolas" w:hAnsi="Consolas"/>
+          <w:sz w:val="20"/>
+          <w:szCs w:val="20"/>
+          <w:shd w:fill="EEEEEE" w:val="clear"/>
+        </w:rPr>
+        <w:t xml:space="preserve">auth_sirene_verified_badge</w:t>
+      </w:r>
+      <w:r>
+        <w:t xml:space="preserve">) s'affiche.</w:t>
       </w:r>
     </w:p>
     <w:p>
@@ -1627,7 +1281,19 @@
         <w:spacing w:after="80"/>
       </w:pPr>
       <w:r>
-        <w:t xml:space="preserve">Après l'étape 1 : le texte modifié reste tel quel, sans être écrasé par une future réponse SIRENE.</w:t>
+        <w:t xml:space="preserve">Le champ « Raison sociale » (</w:t>
+      </w:r>
+      <w:r>
+        <w:rPr>
+          <w:rFonts w:ascii="Consolas" w:cs="Consolas" w:eastAsia="Consolas" w:hAnsi="Consolas"/>
+          <w:sz w:val="20"/>
+          <w:szCs w:val="20"/>
+          <w:shd w:fill="EEEEEE" w:val="clear"/>
+        </w:rPr>
+        <w:t xml:space="preserve">auth_company_name_input</w:t>
+      </w:r>
+      <w:r>
+        <w:t xml:space="preserve">) se remplit automatiquement avec le nom retourné.</w:t>
       </w:r>
     </w:p>
     <w:p>
@@ -1640,6 +1306,383 @@
         <w:spacing w:after="80"/>
       </w:pPr>
       <w:r>
+        <w:t xml:space="preserve">Le bouton « Créer mon espace » devient actif (il était inerte tant que la vérification n'avait pas abouti).</w:t>
+      </w:r>
+    </w:p>
+    <w:p>
+      <w:pPr>
+        <w:pStyle w:val="Heading2"/>
+        <w:spacing w:after="140" w:before="260"/>
+      </w:pPr>
+      <w:r>
+        <w:t xml:space="preserve">[MOB-AUTH-06] Inscription — SIRET introuvable</w:t>
+      </w:r>
+    </w:p>
+    <w:p>
+      <w:pPr>
+        <w:spacing w:after="120"/>
+      </w:pPr>
+      <w:r>
+        <w:rPr>
+          <w:b/>
+          <w:bCs/>
+        </w:rPr>
+        <w:t xml:space="preserve">Type :</w:t>
+      </w:r>
+      <w:r>
+        <w:t xml:space="preserve"> Non passant</w:t>
+      </w:r>
+    </w:p>
+    <w:p>
+      <w:pPr>
+        <w:spacing w:after="120"/>
+      </w:pPr>
+      <w:r>
+        <w:rPr>
+          <w:b/>
+          <w:bCs/>
+        </w:rPr>
+        <w:t xml:space="preserve">Préconditions :</w:t>
+      </w:r>
+      <w:r>
+        <w:t xml:space="preserve"> Onglet « Inscription », champ SIRET vide.</w:t>
+      </w:r>
+    </w:p>
+    <w:p>
+      <w:pPr>
+        <w:spacing w:after="120"/>
+      </w:pPr>
+      <w:r>
+        <w:rPr>
+          <w:b/>
+          <w:bCs/>
+        </w:rPr>
+        <w:t xml:space="preserve">Actions :</w:t>
+      </w:r>
+    </w:p>
+    <w:p>
+      <w:pPr>
+        <w:spacing w:after="80"/>
+        <w:ind w:left="360"/>
+      </w:pPr>
+      <w:r>
+        <w:rPr>
+          <w:b/>
+          <w:bCs/>
+        </w:rPr>
+        <w:t xml:space="preserve">1. </w:t>
+      </w:r>
+      <w:r>
+        <w:t xml:space="preserve">Saisir 14 chiffres ne correspondant à aucune entreprise connue du répertoire SIRENE simulé.</w:t>
+      </w:r>
+    </w:p>
+    <w:p>
+      <w:pPr>
+        <w:spacing w:after="120"/>
+      </w:pPr>
+      <w:r>
+        <w:rPr>
+          <w:b/>
+          <w:bCs/>
+        </w:rPr>
+        <w:t xml:space="preserve">Résultat attendu :</w:t>
+      </w:r>
+      <w:r>
+        <w:t xml:space="preserve"> le message « SIRET introuvable au répertoire SIRENE. » remplace le badge vert ; le champ Raison sociale reste vide ; le bouton « Créer mon espace » reste inerte.</w:t>
+      </w:r>
+    </w:p>
+    <w:p>
+      <w:pPr>
+        <w:pStyle w:val="Heading2"/>
+        <w:spacing w:after="140" w:before="260"/>
+      </w:pPr>
+      <w:r>
+        <w:t xml:space="preserve">[MOB-AUTH-07] Inscription — répertoire SIRENE indisponible</w:t>
+      </w:r>
+    </w:p>
+    <w:p>
+      <w:pPr>
+        <w:spacing w:after="120"/>
+      </w:pPr>
+      <w:r>
+        <w:rPr>
+          <w:b/>
+          <w:bCs/>
+        </w:rPr>
+        <w:t xml:space="preserve">Type :</w:t>
+      </w:r>
+      <w:r>
+        <w:t xml:space="preserve"> Non passant</w:t>
+      </w:r>
+    </w:p>
+    <w:p>
+      <w:pPr>
+        <w:spacing w:after="120"/>
+      </w:pPr>
+      <w:r>
+        <w:rPr>
+          <w:b/>
+          <w:bCs/>
+        </w:rPr>
+        <w:t xml:space="preserve">Préconditions :</w:t>
+      </w:r>
+      <w:r>
+        <w:t xml:space="preserve"> Service de vérification SIRENE simulé en panne (harnais de test).</w:t>
+      </w:r>
+    </w:p>
+    <w:p>
+      <w:pPr>
+        <w:spacing w:after="120"/>
+      </w:pPr>
+      <w:r>
+        <w:rPr>
+          <w:b/>
+          <w:bCs/>
+        </w:rPr>
+        <w:t xml:space="preserve">Actions :</w:t>
+      </w:r>
+    </w:p>
+    <w:p>
+      <w:pPr>
+        <w:spacing w:after="80"/>
+        <w:ind w:left="360"/>
+      </w:pPr>
+      <w:r>
+        <w:rPr>
+          <w:b/>
+          <w:bCs/>
+        </w:rPr>
+        <w:t xml:space="preserve">1. </w:t>
+      </w:r>
+      <w:r>
+        <w:t xml:space="preserve">Saisir un SIRET à 14 chiffres.</w:t>
+      </w:r>
+    </w:p>
+    <w:p>
+      <w:pPr>
+        <w:spacing w:after="120"/>
+      </w:pPr>
+      <w:r>
+        <w:rPr>
+          <w:b/>
+          <w:bCs/>
+        </w:rPr>
+        <w:t xml:space="preserve">Résultat attendu :</w:t>
+      </w:r>
+      <w:r>
+        <w:t xml:space="preserve"> message distinct des deux précédents — « Répertoire SIRENE indisponible, réessayez. » — pour ne pas laisser croire à tort que le SIRET est invalide.</w:t>
+      </w:r>
+    </w:p>
+    <w:p>
+      <w:pPr>
+        <w:pStyle w:val="Heading2"/>
+        <w:spacing w:after="140" w:before="260"/>
+      </w:pPr>
+      <w:r>
+        <w:t xml:space="preserve">[MOB-AUTH-08] Inscription — correction du SIRET pendant une vérification en cours</w:t>
+      </w:r>
+    </w:p>
+    <w:p>
+      <w:pPr>
+        <w:spacing w:after="120"/>
+      </w:pPr>
+      <w:r>
+        <w:rPr>
+          <w:b/>
+          <w:bCs/>
+        </w:rPr>
+        <w:t xml:space="preserve">Type :</w:t>
+      </w:r>
+      <w:r>
+        <w:t xml:space="preserve"> Non passant / cas limite</w:t>
+      </w:r>
+    </w:p>
+    <w:p>
+      <w:pPr>
+        <w:spacing w:after="120"/>
+      </w:pPr>
+      <w:r>
+        <w:rPr>
+          <w:b/>
+          <w:bCs/>
+        </w:rPr>
+        <w:t xml:space="preserve">Préconditions :</w:t>
+      </w:r>
+      <w:r>
+        <w:t xml:space="preserve"> Onglet « Inscription ».</w:t>
+      </w:r>
+    </w:p>
+    <w:p>
+      <w:pPr>
+        <w:spacing w:after="120"/>
+      </w:pPr>
+      <w:r>
+        <w:rPr>
+          <w:b/>
+          <w:bCs/>
+        </w:rPr>
+        <w:t xml:space="preserve">Actions :</w:t>
+      </w:r>
+    </w:p>
+    <w:p>
+      <w:pPr>
+        <w:spacing w:after="80"/>
+        <w:ind w:left="360"/>
+      </w:pPr>
+      <w:r>
+        <w:rPr>
+          <w:b/>
+          <w:bCs/>
+        </w:rPr>
+        <w:t xml:space="preserve">1. </w:t>
+      </w:r>
+      <w:r>
+        <w:t xml:space="preserve">Saisir rapidement 14 chiffres, puis avant l'affichage du résultat, effacer un chiffre et le remplacer par un autre (nouveau SIRET à 14 chiffres).</w:t>
+      </w:r>
+    </w:p>
+    <w:p>
+      <w:pPr>
+        <w:spacing w:after="120"/>
+      </w:pPr>
+      <w:r>
+        <w:rPr>
+          <w:b/>
+          <w:bCs/>
+        </w:rPr>
+        <w:t xml:space="preserve">Résultat attendu :</w:t>
+      </w:r>
+      <w:r>
+        <w:t xml:space="preserve"> seul le résultat de la </w:t>
+      </w:r>
+      <w:r>
+        <w:rPr>
+          <w:b/>
+          <w:bCs/>
+        </w:rPr>
+        <w:t xml:space="preserve">dernière</w:t>
+      </w:r>
+      <w:r>
+        <w:t xml:space="preserve"> saisie s'affiche ; aucun résultat obsolète de la première vérification n'apparaît après coup (annulation de la requête en vol).</w:t>
+      </w:r>
+    </w:p>
+    <w:p>
+      <w:pPr>
+        <w:pStyle w:val="Heading2"/>
+        <w:spacing w:after="140" w:before="260"/>
+      </w:pPr>
+      <w:r>
+        <w:t xml:space="preserve">[MOB-AUTH-09] Inscription — nom auto-rempli puis modifié manuellement</w:t>
+      </w:r>
+    </w:p>
+    <w:p>
+      <w:pPr>
+        <w:spacing w:after="120"/>
+      </w:pPr>
+      <w:r>
+        <w:rPr>
+          <w:b/>
+          <w:bCs/>
+        </w:rPr>
+        <w:t xml:space="preserve">Type :</w:t>
+      </w:r>
+      <w:r>
+        <w:t xml:space="preserve"> Passant</w:t>
+      </w:r>
+    </w:p>
+    <w:p>
+      <w:pPr>
+        <w:spacing w:after="120"/>
+      </w:pPr>
+      <w:r>
+        <w:rPr>
+          <w:b/>
+          <w:bCs/>
+        </w:rPr>
+        <w:t xml:space="preserve">Préconditions :</w:t>
+      </w:r>
+      <w:r>
+        <w:t xml:space="preserve"> SIRET vérifié avec succès, champ Raison sociale auto-rempli.</w:t>
+      </w:r>
+    </w:p>
+    <w:p>
+      <w:pPr>
+        <w:spacing w:after="120"/>
+      </w:pPr>
+      <w:r>
+        <w:rPr>
+          <w:b/>
+          <w:bCs/>
+        </w:rPr>
+        <w:t xml:space="preserve">Actions :</w:t>
+      </w:r>
+    </w:p>
+    <w:p>
+      <w:pPr>
+        <w:spacing w:after="80"/>
+        <w:ind w:left="360"/>
+      </w:pPr>
+      <w:r>
+        <w:rPr>
+          <w:b/>
+          <w:bCs/>
+        </w:rPr>
+        <w:t xml:space="preserve">1. </w:t>
+      </w:r>
+      <w:r>
+        <w:t xml:space="preserve">Taper dans le champ Raison sociale et modifier le texte auto-rempli.</w:t>
+      </w:r>
+    </w:p>
+    <w:p>
+      <w:pPr>
+        <w:spacing w:after="80"/>
+        <w:ind w:left="360"/>
+      </w:pPr>
+      <w:r>
+        <w:rPr>
+          <w:b/>
+          <w:bCs/>
+        </w:rPr>
+        <w:t xml:space="preserve">2. </w:t>
+      </w:r>
+      <w:r>
+        <w:t xml:space="preserve">Effacer un chiffre du SIRET (le faisant repasser sous 14 chiffres) puis le ressaisir.</w:t>
+      </w:r>
+    </w:p>
+    <w:p>
+      <w:pPr>
+        <w:spacing w:after="120"/>
+      </w:pPr>
+      <w:r>
+        <w:rPr>
+          <w:b/>
+          <w:bCs/>
+        </w:rPr>
+        <w:t xml:space="preserve">Résultat attendu :</w:t>
+      </w:r>
+    </w:p>
+    <w:p>
+      <w:pPr>
+        <w:pStyle w:val="ListParagraph"/>
+        <w:numPr>
+          <w:ilvl w:val="0"/>
+          <w:numId w:val="1"/>
+        </w:numPr>
+        <w:spacing w:after="80"/>
+      </w:pPr>
+      <w:r>
+        <w:t xml:space="preserve">Après l'étape 1 : le texte modifié reste tel quel, sans être écrasé par une future réponse SIRENE.</w:t>
+      </w:r>
+    </w:p>
+    <w:p>
+      <w:pPr>
+        <w:pStyle w:val="ListParagraph"/>
+        <w:numPr>
+          <w:ilvl w:val="0"/>
+          <w:numId w:val="1"/>
+        </w:numPr>
+        <w:spacing w:after="80"/>
+      </w:pPr>
+      <w:r>
         <w:t xml:space="preserve">Après l'étape 2 : le nom modifié manuellement </w:t>
       </w:r>
       <w:r>
@@ -1651,6 +1694,365 @@
       </w:r>
       <w:r>
         <w:t xml:space="preserve"> (seul un nom encore auto-rempli serait vidé quand le SIRET redescend sous 14 chiffres).</w:t>
+      </w:r>
+    </w:p>
+    <w:p>
+      <w:pPr>
+        <w:pStyle w:val="Heading2"/>
+        <w:spacing w:after="140" w:before="260"/>
+      </w:pPr>
+      <w:r>
+        <w:t xml:space="preserve">[MOB-AUTH-10] Inscription — le compte est réellement enregistré (US-26)</w:t>
+      </w:r>
+    </w:p>
+    <w:p>
+      <w:pPr>
+        <w:spacing w:after="120"/>
+      </w:pPr>
+      <w:r>
+        <w:rPr>
+          <w:b/>
+          <w:bCs/>
+        </w:rPr>
+        <w:t xml:space="preserve">Type :</w:t>
+      </w:r>
+      <w:r>
+        <w:t xml:space="preserve"> Passant</w:t>
+      </w:r>
+    </w:p>
+    <w:p>
+      <w:pPr>
+        <w:spacing w:after="120"/>
+      </w:pPr>
+      <w:r>
+        <w:rPr>
+          <w:b/>
+          <w:bCs/>
+        </w:rPr>
+        <w:t xml:space="preserve">Préconditions :</w:t>
+      </w:r>
+      <w:r>
+        <w:t xml:space="preserve"> Installation neuve (ou données de l'application effacées), écran d'authentification affiché.</w:t>
+      </w:r>
+    </w:p>
+    <w:p>
+      <w:pPr>
+        <w:spacing w:after="120"/>
+      </w:pPr>
+      <w:r>
+        <w:rPr>
+          <w:b/>
+          <w:bCs/>
+        </w:rPr>
+        <w:t xml:space="preserve">Actions :</w:t>
+      </w:r>
+    </w:p>
+    <w:p>
+      <w:pPr>
+        <w:spacing w:after="80"/>
+        <w:ind w:left="360"/>
+      </w:pPr>
+      <w:r>
+        <w:rPr>
+          <w:b/>
+          <w:bCs/>
+        </w:rPr>
+        <w:t xml:space="preserve">1. </w:t>
+      </w:r>
+      <w:r>
+        <w:t xml:space="preserve">Onglet « Inscription » : saisir le SIRET de démonstration, attendre le badge vert, puis saisir une adresse email et un mot de passe.</w:t>
+      </w:r>
+    </w:p>
+    <w:p>
+      <w:pPr>
+        <w:spacing w:after="80"/>
+        <w:ind w:left="360"/>
+      </w:pPr>
+      <w:r>
+        <w:rPr>
+          <w:b/>
+          <w:bCs/>
+        </w:rPr>
+        <w:t xml:space="preserve">2. </w:t>
+      </w:r>
+      <w:r>
+        <w:t xml:space="preserve">Taper « Créer mon espace ».</w:t>
+      </w:r>
+    </w:p>
+    <w:p>
+      <w:pPr>
+        <w:spacing w:after="80"/>
+        <w:ind w:left="360"/>
+      </w:pPr>
+      <w:r>
+        <w:rPr>
+          <w:b/>
+          <w:bCs/>
+        </w:rPr>
+        <w:t xml:space="preserve">3. </w:t>
+      </w:r>
+      <w:r>
+        <w:t xml:space="preserve">Une fois le tableau de bord ouvert, </w:t>
+      </w:r>
+      <w:r>
+        <w:rPr>
+          <w:b/>
+          <w:bCs/>
+        </w:rPr>
+        <w:t xml:space="preserve">fermer entièrement l'application</w:t>
+      </w:r>
+      <w:r>
+        <w:t xml:space="preserve"> (la retirer des applications récentes) et la relancer.</w:t>
+      </w:r>
+    </w:p>
+    <w:p>
+      <w:pPr>
+        <w:spacing w:after="80"/>
+        <w:ind w:left="360"/>
+      </w:pPr>
+      <w:r>
+        <w:rPr>
+          <w:b/>
+          <w:bCs/>
+        </w:rPr>
+        <w:t xml:space="preserve">4. </w:t>
+      </w:r>
+      <w:r>
+        <w:t xml:space="preserve">Onglet « Connexion » : saisir la </w:t>
+      </w:r>
+      <w:r>
+        <w:rPr>
+          <w:b/>
+          <w:bCs/>
+        </w:rPr>
+        <w:t xml:space="preserve">même</w:t>
+      </w:r>
+      <w:r>
+        <w:t xml:space="preserve"> adresse et le </w:t>
+      </w:r>
+      <w:r>
+        <w:rPr>
+          <w:b/>
+          <w:bCs/>
+        </w:rPr>
+        <w:t xml:space="preserve">même</w:t>
+      </w:r>
+      <w:r>
+        <w:t xml:space="preserve"> mot de passe, taper « Se connecter ».</w:t>
+      </w:r>
+    </w:p>
+    <w:p>
+      <w:pPr>
+        <w:spacing w:after="120"/>
+      </w:pPr>
+      <w:r>
+        <w:rPr>
+          <w:b/>
+          <w:bCs/>
+        </w:rPr>
+        <w:t xml:space="preserve">Résultat attendu :</w:t>
+      </w:r>
+    </w:p>
+    <w:p>
+      <w:pPr>
+        <w:pStyle w:val="ListParagraph"/>
+        <w:numPr>
+          <w:ilvl w:val="0"/>
+          <w:numId w:val="1"/>
+        </w:numPr>
+        <w:spacing w:after="80"/>
+      </w:pPr>
+      <w:r>
+        <w:t xml:space="preserve">Après l'étape 2 : le shell s'ouvre sur le tableau de bord.</w:t>
+      </w:r>
+    </w:p>
+    <w:p>
+      <w:pPr>
+        <w:pStyle w:val="ListParagraph"/>
+        <w:numPr>
+          <w:ilvl w:val="0"/>
+          <w:numId w:val="1"/>
+        </w:numPr>
+        <w:spacing w:after="80"/>
+      </w:pPr>
+      <w:r>
+        <w:t xml:space="preserve">Après l'étape 3 : l'application redemande une authentification (la session n'est pas conservée).</w:t>
+      </w:r>
+    </w:p>
+    <w:p>
+      <w:pPr>
+        <w:pStyle w:val="ListParagraph"/>
+        <w:numPr>
+          <w:ilvl w:val="0"/>
+          <w:numId w:val="1"/>
+        </w:numPr>
+        <w:spacing w:after="80"/>
+      </w:pPr>
+      <w:r>
+        <w:t xml:space="preserve">Après l'étape 4 : la connexion aboutit </w:t>
+      </w:r>
+      <w:r>
+        <w:rPr>
+          <w:b/>
+          <w:bCs/>
+        </w:rPr>
+        <w:t xml:space="preserve">sans réseau ni serveur</w:t>
+      </w:r>
+      <w:r>
+        <w:t xml:space="preserve"> — le compte a survécu à la fermeture du processus. Mode avion activé, le résultat doit être identique.</w:t>
+      </w:r>
+    </w:p>
+    <w:p>
+      <w:pPr>
+        <w:pStyle w:val="Heading2"/>
+        <w:spacing w:after="140" w:before="260"/>
+      </w:pPr>
+      <w:r>
+        <w:t xml:space="preserve">[MOB-AUTH-11] Inscription — adresse déjà utilisée (US-26)</w:t>
+      </w:r>
+    </w:p>
+    <w:p>
+      <w:pPr>
+        <w:spacing w:after="120"/>
+      </w:pPr>
+      <w:r>
+        <w:rPr>
+          <w:b/>
+          <w:bCs/>
+        </w:rPr>
+        <w:t xml:space="preserve">Type :</w:t>
+      </w:r>
+      <w:r>
+        <w:t xml:space="preserve"> Non passant</w:t>
+      </w:r>
+    </w:p>
+    <w:p>
+      <w:pPr>
+        <w:spacing w:after="120"/>
+      </w:pPr>
+      <w:r>
+        <w:rPr>
+          <w:b/>
+          <w:bCs/>
+        </w:rPr>
+        <w:t xml:space="preserve">Préconditions :</w:t>
+      </w:r>
+      <w:r>
+        <w:t xml:space="preserve"> [MOB-AUTH-10] déjà exécuté, donc un compte existe sur l'appareil.</w:t>
+      </w:r>
+    </w:p>
+    <w:p>
+      <w:pPr>
+        <w:spacing w:after="120"/>
+      </w:pPr>
+      <w:r>
+        <w:rPr>
+          <w:b/>
+          <w:bCs/>
+        </w:rPr>
+        <w:t xml:space="preserve">Actions :</w:t>
+      </w:r>
+    </w:p>
+    <w:p>
+      <w:pPr>
+        <w:spacing w:after="80"/>
+        <w:ind w:left="360"/>
+      </w:pPr>
+      <w:r>
+        <w:rPr>
+          <w:b/>
+          <w:bCs/>
+        </w:rPr>
+        <w:t xml:space="preserve">1. </w:t>
+      </w:r>
+      <w:r>
+        <w:t xml:space="preserve">Onglet « Inscription » : refaire une inscription complète avec la </w:t>
+      </w:r>
+      <w:r>
+        <w:rPr>
+          <w:b/>
+          <w:bCs/>
+        </w:rPr>
+        <w:t xml:space="preserve">même adresse email</w:t>
+      </w:r>
+      <w:r>
+        <w:t xml:space="preserve"> et un mot de passe différent.</w:t>
+      </w:r>
+    </w:p>
+    <w:p>
+      <w:pPr>
+        <w:spacing w:after="80"/>
+        <w:ind w:left="360"/>
+      </w:pPr>
+      <w:r>
+        <w:rPr>
+          <w:b/>
+          <w:bCs/>
+        </w:rPr>
+        <w:t xml:space="preserve">2. </w:t>
+      </w:r>
+      <w:r>
+        <w:t xml:space="preserve">Taper « Créer mon espace ».</w:t>
+      </w:r>
+    </w:p>
+    <w:p>
+      <w:pPr>
+        <w:spacing w:after="120"/>
+      </w:pPr>
+      <w:r>
+        <w:rPr>
+          <w:b/>
+          <w:bCs/>
+        </w:rPr>
+        <w:t xml:space="preserve">Résultat attendu :</w:t>
+      </w:r>
+    </w:p>
+    <w:p>
+      <w:pPr>
+        <w:pStyle w:val="ListParagraph"/>
+        <w:numPr>
+          <w:ilvl w:val="0"/>
+          <w:numId w:val="1"/>
+        </w:numPr>
+        <w:spacing w:after="80"/>
+      </w:pPr>
+      <w:r>
+        <w:t xml:space="preserve">Le shell ne s'ouvre pas ; le message « Un compte existe déjà pour cette adresse — connectez-vous. » apparaît dans </w:t>
+      </w:r>
+      <w:r>
+        <w:rPr>
+          <w:rFonts w:ascii="Consolas" w:cs="Consolas" w:eastAsia="Consolas" w:hAnsi="Consolas"/>
+          <w:sz w:val="20"/>
+          <w:szCs w:val="20"/>
+          <w:shd w:fill="EEEEEE" w:val="clear"/>
+        </w:rPr>
+        <w:t xml:space="preserve">login_error_message</w:t>
+      </w:r>
+      <w:r>
+        <w:t xml:space="preserve">.</w:t>
+      </w:r>
+    </w:p>
+    <w:p>
+      <w:pPr>
+        <w:pStyle w:val="ListParagraph"/>
+        <w:numPr>
+          <w:ilvl w:val="0"/>
+          <w:numId w:val="1"/>
+        </w:numPr>
+        <w:spacing w:after="80"/>
+      </w:pPr>
+      <w:r>
+        <w:t xml:space="preserve">Le compte d'origine est intact : la connexion avec le </w:t>
+      </w:r>
+      <w:r>
+        <w:rPr>
+          <w:b/>
+          <w:bCs/>
+        </w:rPr>
+        <w:t xml:space="preserve">premier</w:t>
+      </w:r>
+      <w:r>
+        <w:t xml:space="preserve"> mot de passe fonctionne toujours, celle avec le second échoue.</w:t>
       </w:r>
     </w:p>
     <w:p>
@@ -14964,7 +15366,7 @@
           <w:i/>
           <w:iCs/>
         </w:rPr>
-        <w:t xml:space="preserve">⚠️ </w:t>
+        <w:t xml:space="preserve">Joignable depuis l'US-26 : onglet </w:t>
       </w:r>
       <w:r>
         <w:rPr>
@@ -14973,86 +15375,14 @@
           <w:i/>
           <w:iCs/>
         </w:rPr>
-        <w:t xml:space="preserve">Non atteignable depuis le parcours normal de l'application</w:t>
+        <w:t xml:space="preserve">Paramètres</w:t>
       </w:r>
       <w:r>
         <w:rPr>
           <w:i/>
           <w:iCs/>
         </w:rPr>
-        <w:t xml:space="preserve"> — comme l'écran de connexion (module 1), </w:t>
-      </w:r>
-      <w:r>
-        <w:rPr>
-          <w:rFonts w:ascii="Consolas" w:cs="Consolas" w:eastAsia="Consolas" w:hAnsi="Consolas"/>
-          <w:i/>
-          <w:iCs/>
-          <w:sz w:val="20"/>
-          <w:szCs w:val="20"/>
-          <w:shd w:fill="EEEEEE" w:val="clear"/>
-        </w:rPr>
-        <w:t xml:space="preserve">EReportingScreen</w:t>
-      </w:r>
-      <w:r>
-        <w:rPr>
-          <w:i/>
-          <w:iCs/>
-        </w:rPr>
-        <w:t xml:space="preserve"> et </w:t>
-      </w:r>
-      <w:r>
-        <w:rPr>
-          <w:rFonts w:ascii="Consolas" w:cs="Consolas" w:eastAsia="Consolas" w:hAnsi="Consolas"/>
-          <w:i/>
-          <w:iCs/>
-          <w:sz w:val="20"/>
-          <w:szCs w:val="20"/>
-          <w:shd w:fill="EEEEEE" w:val="clear"/>
-        </w:rPr>
-        <w:t xml:space="preserve">EReportingViewModel</w:t>
-      </w:r>
-      <w:r>
-        <w:rPr>
-          <w:i/>
-          <w:iCs/>
-        </w:rPr>
-        <w:t xml:space="preserve"> ne sont référencés nulle part dans </w:t>
-      </w:r>
-      <w:r>
-        <w:rPr>
-          <w:rFonts w:ascii="Consolas" w:cs="Consolas" w:eastAsia="Consolas" w:hAnsi="Consolas"/>
-          <w:i/>
-          <w:iCs/>
-          <w:sz w:val="20"/>
-          <w:szCs w:val="20"/>
-          <w:shd w:fill="EEEEEE" w:val="clear"/>
-        </w:rPr>
-        <w:t xml:space="preserve">App.kt</w:t>
-      </w:r>
-      <w:r>
-        <w:rPr>
-          <w:i/>
-          <w:iCs/>
-        </w:rPr>
-        <w:t xml:space="preserve"> ni dans aucun autre écran de production : aucun onglet de la barre basse, aucune sidebar, aucune surimpression n'y mène. Un testeur manuel sur l'APK standard ne peut pas l'atteindre. Les scénarios ci-dessous supposent un harnais de test montant </w:t>
-      </w:r>
-      <w:r>
-        <w:rPr>
-          <w:rFonts w:ascii="Consolas" w:cs="Consolas" w:eastAsia="Consolas" w:hAnsi="Consolas"/>
-          <w:i/>
-          <w:iCs/>
-          <w:sz w:val="20"/>
-          <w:szCs w:val="20"/>
-          <w:shd w:fill="EEEEEE" w:val="clear"/>
-        </w:rPr>
-        <w:t xml:space="preserve">EReportingScreen</w:t>
-      </w:r>
-      <w:r>
-        <w:rPr>
-          <w:i/>
-          <w:iCs/>
-        </w:rPr>
-        <w:t xml:space="preserve"> directement, ou une intégration future dans la navigation. Voir l'encart Dette Technique ci-après.</w:t>
+        <w:t xml:space="preserve">, action « e-Reporting » posée en tête d'écran. Elle s'ouvre en surimpression et non en septième onglet — la barre de navigation compacte en porte déjà six, dont les libellés se coupent sur un Pixel 5.</w:t>
       </w:r>
     </w:p>
     <w:p>
@@ -15910,7 +16240,7 @@
         <w:spacing w:after="140" w:before="260"/>
       </w:pPr>
       <w:r>
-        <w:t xml:space="preserve">1. Deux écrans complets, entièrement développés et testés unitairement, sont injoignables depuis l'application</w:t>
+        <w:t xml:space="preserve">1. ✅ Clos en US-26 — les deux écrans injoignables sont câblés, et l'authentification est réelle</w:t>
       </w:r>
     </w:p>
     <w:tbl>
@@ -16071,19 +16401,26 @@
           <w:p>
             <w:r>
               <w:rPr>
+                <w:sz w:val="18"/>
+                <w:szCs w:val="18"/>
+              </w:rPr>
+              <w:t xml:space="preserve">✅ </w:t>
+            </w:r>
+            <w:r>
+              <w:rPr>
                 <w:b/>
                 <w:bCs/>
                 <w:sz w:val="18"/>
                 <w:szCs w:val="18"/>
               </w:rPr>
-              <w:t xml:space="preserve">Aucune référence dans `App.kt`</w:t>
+              <w:t xml:space="preserve">Écran d'accueil</w:t>
             </w:r>
             <w:r>
               <w:rPr>
                 <w:sz w:val="18"/>
                 <w:szCs w:val="18"/>
               </w:rPr>
-              <w:t xml:space="preserve"> — aucun bouton, aucun onglet, aucune surimpression n'y mène</w:t>
+              <w:t xml:space="preserve"> — l'application s'ouvre dessus, avant le shell</w:t>
             </w:r>
           </w:p>
         </w:tc>
@@ -16158,19 +16495,26 @@
           <w:p>
             <w:r>
               <w:rPr>
+                <w:sz w:val="18"/>
+                <w:szCs w:val="18"/>
+              </w:rPr>
+              <w:t xml:space="preserve">✅ </w:t>
+            </w:r>
+            <w:r>
+              <w:rPr>
                 <w:b/>
                 <w:bCs/>
                 <w:sz w:val="18"/>
                 <w:szCs w:val="18"/>
               </w:rPr>
-              <w:t xml:space="preserve">Aucune référence dans `App.kt`</w:t>
+              <w:t xml:space="preserve">Onglet Paramètres</w:t>
             </w:r>
             <w:r>
               <w:rPr>
                 <w:sz w:val="18"/>
                 <w:szCs w:val="18"/>
               </w:rPr>
-              <w:t xml:space="preserve"> — même constat</w:t>
+              <w:t xml:space="preserve"> — action en tête d'écran, ouverte en surimpression</w:t>
             </w:r>
           </w:p>
         </w:tc>
@@ -16186,7 +16530,7 @@
         <w:spacing w:after="120"/>
       </w:pPr>
       <w:r>
-        <w:t xml:space="preserve">Vérifié par recherche exhaustive du nom de la classe/fonction dans </w:t>
+        <w:t xml:space="preserve">Le constat d'origine — les deux écrans complets, testés, et référencés nulle part dans </w:t>
       </w:r>
       <w:r>
         <w:rPr>
@@ -16195,10 +16539,18 @@
           <w:szCs w:val="20"/>
           <w:shd w:fill="EEEEEE" w:val="clear"/>
         </w:rPr>
-        <w:t xml:space="preserve">commonMain</w:t>
-      </w:r>
-      <w:r>
-        <w:t xml:space="preserve">, </w:t>
+        <w:t xml:space="preserve">App.kt</w:t>
+      </w:r>
+      <w:r>
+        <w:t xml:space="preserve"> — a été relevé pendant la rédaction de ce plan puis corrigé en US-26. Les modules 1 et 11 sont désormais exécutables en parcourant l'application normalement, sans harnais.</w:t>
+      </w:r>
+    </w:p>
+    <w:p>
+      <w:pPr>
+        <w:spacing w:after="120"/>
+      </w:pPr>
+      <w:r>
+        <w:t xml:space="preserve">Une seconde moitié de cette dette a été close dans la foulée : l'écran de connexion s'adressait à un backend HTTP local (</w:t>
       </w:r>
       <w:r>
         <w:rPr>
@@ -16207,10 +16559,20 @@
           <w:szCs w:val="20"/>
           <w:shd w:fill="EEEEEE" w:val="clear"/>
         </w:rPr>
-        <w:t xml:space="preserve">androidMain</w:t>
-      </w:r>
-      <w:r>
-        <w:t xml:space="preserve"> et </w:t>
+        <w:t xml:space="preserve">http://10.0.2.2:3000</w:t>
+      </w:r>
+      <w:r>
+        <w:t xml:space="preserve">) qui n'existe pas hors poste de développement, et l'inscription ne faisait que lever un drapeau en mémoire. L'authentification est désormais </w:t>
+      </w:r>
+      <w:r>
+        <w:rPr>
+          <w:b/>
+          <w:bCs/>
+        </w:rPr>
+        <w:t xml:space="preserve">autonome</w:t>
+      </w:r>
+      <w:r>
+        <w:t xml:space="preserve"> — le compte est écrit dans la base SQLDelight de l'appareil, mot de passe salé et haché (</w:t>
       </w:r>
       <w:r>
         <w:rPr>
@@ -16219,45 +16581,10 @@
           <w:szCs w:val="20"/>
           <w:shd w:fill="EEEEEE" w:val="clear"/>
         </w:rPr>
-        <w:t xml:space="preserve">iosMain</w:t>
-      </w:r>
-      <w:r>
-        <w:t xml:space="preserve"> : en dehors de leur propre paquet, aucune occurrence en dehors de mentions en commentaire KDoc. Ce n'est donc pas un oubli d'un seul bouton mais une </w:t>
-      </w:r>
-      <w:r>
-        <w:rPr>
-          <w:b/>
-          <w:bCs/>
-        </w:rPr>
-        <w:t xml:space="preserve">absence totale de câblage</w:t>
-      </w:r>
-      <w:r>
-        <w:t xml:space="preserve"> — ces deux US sont fonctionnellement complètes et invisibles pour un utilisateur final comme pour un testeur manuel sur l'APK standard.</w:t>
-      </w:r>
-    </w:p>
-    <w:p>
-      <w:pPr>
-        <w:spacing w:after="120"/>
-      </w:pPr>
-      <w:r>
-        <w:rPr>
-          <w:b/>
-          <w:bCs/>
-        </w:rPr>
-        <w:t xml:space="preserve">Impact recette :</w:t>
-      </w:r>
-      <w:r>
-        <w:t xml:space="preserve"> les modules 1 (Auth) et 11 (e-Reporting) de ce plan ne sont exécutables qu'avec un harnais de test dédié (montage direct du composable), jamais en parcourant l'application normalement. Un testeur qui ne trouve pas ces écrans en explorant l'app </w:t>
-      </w:r>
-      <w:r>
-        <w:rPr>
-          <w:b/>
-          <w:bCs/>
-        </w:rPr>
-        <w:t xml:space="preserve">ne doit pas conclure à une régression</w:t>
-      </w:r>
-      <w:r>
-        <w:t xml:space="preserve"> — c'est l'état actuel, documenté ici.</w:t>
+        <w:t xml:space="preserve">domain.auth.PasswordHash</w:t>
+      </w:r>
+      <w:r>
+        <w:t xml:space="preserve">), et la connexion l'y retrouve. L'application n'a donc plus aucune dépendance réseau pour démarrer.</w:t>
       </w:r>
     </w:p>
     <w:p>
@@ -17756,7 +18083,7 @@
                 <w:sz w:val="18"/>
                 <w:szCs w:val="18"/>
               </w:rPr>
-              <w:t xml:space="preserve">11 (⚠️ écran non câblé dans la navigation — voir Dette Technique)</w:t>
+              <w:t xml:space="preserve">11 (câblé dans l'onglet Paramètres depuis l'US-26)</w:t>
             </w:r>
           </w:p>
         </w:tc>
@@ -18815,6 +19142,68 @@
           </w:p>
         </w:tc>
       </w:tr>
+      <w:tr>
+        <w:tc>
+          <w:tcPr>
+            <w:tcW w:type="dxa" w:w="3120"/>
+            <w:tcMar>
+              <w:top w:type="dxa" w:w="60"/>
+              <w:left w:type="dxa" w:w="100"/>
+              <w:bottom w:type="dxa" w:w="60"/>
+              <w:right w:type="dxa" w:w="100"/>
+            </w:tcMar>
+          </w:tcPr>
+          <w:p>
+            <w:r>
+              <w:rPr>
+                <w:sz w:val="18"/>
+                <w:szCs w:val="18"/>
+              </w:rPr>
+              <w:t xml:space="preserve">US-26</w:t>
+            </w:r>
+          </w:p>
+        </w:tc>
+        <w:tc>
+          <w:tcPr>
+            <w:tcW w:type="dxa" w:w="3120"/>
+            <w:tcMar>
+              <w:top w:type="dxa" w:w="60"/>
+              <w:left w:type="dxa" w:w="100"/>
+              <w:bottom w:type="dxa" w:w="60"/>
+              <w:right w:type="dxa" w:w="100"/>
+            </w:tcMar>
+          </w:tcPr>
+          <w:p>
+            <w:r>
+              <w:rPr>
+                <w:sz w:val="18"/>
+                <w:szCs w:val="18"/>
+              </w:rPr>
+              <w:t xml:space="preserve">Release candidate : navigation auth/e-Reporting, SIRENE réelle, compte local</w:t>
+            </w:r>
+          </w:p>
+        </w:tc>
+        <w:tc>
+          <w:tcPr>
+            <w:tcW w:type="dxa" w:w="3120"/>
+            <w:tcMar>
+              <w:top w:type="dxa" w:w="60"/>
+              <w:left w:type="dxa" w:w="100"/>
+              <w:bottom w:type="dxa" w:w="60"/>
+              <w:right w:type="dxa" w:w="100"/>
+            </w:tcMar>
+          </w:tcPr>
+          <w:p>
+            <w:r>
+              <w:rPr>
+                <w:sz w:val="18"/>
+                <w:szCs w:val="18"/>
+              </w:rPr>
+              <w:t xml:space="preserve">1 (MOB-AUTH-01/03/10/11), 11</w:t>
+            </w:r>
+          </w:p>
+        </w:tc>
+      </w:tr>
     </w:tbl>
     <w:p>
       <w:pPr>

</xml_diff>